<commit_message>
Guide matches editing being off by default; updates remove old images
Getting started guide, re-shot with in-browser editing off (the default now):
- Opening a file: the first button is the desktop app, no Open in menu; the
  editing-on layout is a note.
- Create menu: picture added, steps match its badges (folder, Markdown, text);
  Word/Excel creation is a note; Create in a read-only library offers only New
  library.
- Edit notices are framed as needing browser editing.
- Corrected: what the Home Shared tile counts, Move to library (folders too),
  which text files preview, and that sign-in continues on a page of its own.
- PDF and Word builders keep a heading with its list when a section has no
  picture or steps.

upgrade.sh: once the new release is healthy, remove Depot images no container
uses. Each release left one behind; one server's disk filled with 124 of them.

Co-Authored-By: Claude Opus 5.5 <noreply@anthropic.com>
</commit_message>
<xml_diff>
--- a/server/assets/getting-started/Getting started with Depot.docx
+++ b/server/assets/getting-started/Getting started with Depot.docx
@@ -2450,7 +2450,7 @@
         <w:t xml:space="preserve">Sign in with email &amp; password</w:t>
       </w:r>
       <w:r>
-        <w:t xml:space="preserve">. If you forget your password, ask your administrator.</w:t>
+        <w:t xml:space="preserve">, then type your email and password on the page that opens. If you forget your password, ask your administrator.</w:t>
       </w:r>
     </w:p>
     <w:p>
@@ -2887,6 +2887,7 @@
     <w:p>
       <w:pPr>
         <w:pStyle w:val="ListParagraph"/>
+        <w:keepNext w:val="false"/>
         <w:keepLines/>
         <w:numPr>
           <w:ilvl w:val="0"/>
@@ -2901,6 +2902,7 @@
     <w:p>
       <w:pPr>
         <w:pStyle w:val="ListParagraph"/>
+        <w:keepNext w:val="false"/>
         <w:keepLines/>
         <w:numPr>
           <w:ilvl w:val="0"/>
@@ -2952,6 +2954,7 @@
     <w:p>
       <w:pPr>
         <w:pStyle w:val="ListParagraph"/>
+        <w:keepNext/>
         <w:keepLines/>
         <w:numPr>
           <w:ilvl w:val="0"/>
@@ -3023,6 +3026,7 @@
     <w:p>
       <w:pPr>
         <w:pStyle w:val="ListParagraph"/>
+        <w:keepNext/>
         <w:keepLines/>
         <w:numPr>
           <w:ilvl w:val="0"/>
@@ -3044,6 +3048,7 @@
     <w:p>
       <w:pPr>
         <w:pStyle w:val="ListParagraph"/>
+        <w:keepNext/>
         <w:keepLines/>
         <w:numPr>
           <w:ilvl w:val="0"/>
@@ -3068,6 +3073,7 @@
     <w:p>
       <w:pPr>
         <w:pStyle w:val="ListParagraph"/>
+        <w:keepNext w:val="false"/>
         <w:keepLines/>
         <w:numPr>
           <w:ilvl w:val="0"/>
@@ -3238,7 +3244,7 @@
         <w:t xml:space="preserve">Shared</w:t>
       </w:r>
       <w:r>
-        <w:t xml:space="preserve"> shows how many of your files have a link.</w:t>
+        <w:t xml:space="preserve"> counts files others added, and your live links.</w:t>
       </w:r>
     </w:p>
     <w:p>
@@ -3663,91 +3669,6 @@
         <w:t xml:space="preserve">Create a new file or folder</w:t>
       </w:r>
     </w:p>
-    <w:p>
-      <w:pPr>
-        <w:pStyle w:val="ListParagraph"/>
-        <w:keepNext/>
-        <w:keepLines/>
-        <w:numPr>
-          <w:ilvl w:val="0"/>
-          <w:numId w:val="9"/>
-        </w:numPr>
-        <w:spacing w:after="140" w:before="0"/>
-      </w:pPr>
-      <w:r>
-        <w:t xml:space="preserve">Click </w:t>
-      </w:r>
-      <w:r>
-        <w:rPr>
-          <w:b/>
-          <w:bCs/>
-        </w:rPr>
-        <w:t xml:space="preserve">Create</w:t>
-      </w:r>
-      <w:r>
-        <w:t xml:space="preserve">, then choose </w:t>
-      </w:r>
-      <w:r>
-        <w:rPr>
-          <w:b/>
-          <w:bCs/>
-        </w:rPr>
-        <w:t xml:space="preserve">New folder</w:t>
-      </w:r>
-      <w:r>
-        <w:t xml:space="preserve">, </w:t>
-      </w:r>
-      <w:r>
-        <w:rPr>
-          <w:b/>
-          <w:bCs/>
-        </w:rPr>
-        <w:t xml:space="preserve">New Word document</w:t>
-      </w:r>
-      <w:r>
-        <w:t xml:space="preserve"> or </w:t>
-      </w:r>
-      <w:r>
-        <w:rPr>
-          <w:b/>
-          <w:bCs/>
-        </w:rPr>
-        <w:t xml:space="preserve">New Excel spreadsheet</w:t>
-      </w:r>
-      <w:r>
-        <w:t xml:space="preserve">.</w:t>
-      </w:r>
-    </w:p>
-    <w:p>
-      <w:pPr>
-        <w:pStyle w:val="ListParagraph"/>
-        <w:keepNext w:val="false"/>
-        <w:keepLines/>
-        <w:numPr>
-          <w:ilvl w:val="0"/>
-          <w:numId w:val="9"/>
-        </w:numPr>
-        <w:spacing w:after="140" w:before="0"/>
-      </w:pPr>
-      <w:r>
-        <w:t xml:space="preserve">Type a name and click </w:t>
-      </w:r>
-      <w:r>
-        <w:rPr>
-          <w:b/>
-          <w:bCs/>
-        </w:rPr>
-        <w:t xml:space="preserve">OK</w:t>
-      </w:r>
-      <w:r>
-        <w:t xml:space="preserve">. A new file opens straight away.</w:t>
-      </w:r>
-    </w:p>
-    <w:p>
-      <w:pPr>
-        <w:spacing w:after="60" w:before="0" w:line="240"/>
-      </w:pPr>
-    </w:p>
     <w:tbl>
       <w:tblPr>
         <w:tblW w:type="dxa" w:w="9360"/>
@@ -3762,7 +3683,8 @@
         <w:tblLayout w:type="fixed"/>
       </w:tblPr>
       <w:tblGrid>
-        <w:gridCol w:w="9360"/>
+        <w:gridCol w:w="4636"/>
+        <w:gridCol w:w="4724"/>
       </w:tblGrid>
       <w:tr>
         <w:trPr>
@@ -3770,54 +3692,392 @@
         </w:trPr>
         <w:tc>
           <w:tcPr>
-            <w:tcW w:type="dxa" w:w="9360"/>
+            <w:tcW w:type="dxa" w:w="4636"/>
             <w:tcBorders>
               <w:top w:val="none" w:color="FFFFFF" w:sz="0"/>
-              <w:left w:val="single" w:color="9A6212" w:sz="32"/>
+              <w:left w:val="none" w:color="FFFFFF" w:sz="0"/>
               <w:bottom w:val="none" w:color="FFFFFF" w:sz="0"/>
               <w:right w:val="none" w:color="FFFFFF" w:sz="0"/>
             </w:tcBorders>
-            <w:shd w:fill="FBF3E6" w:color="auto" w:val="clear"/>
             <w:tcMar>
-              <w:top w:type="dxa" w:w="202"/>
-              <w:left w:type="dxa" w:w="317"/>
-              <w:bottom w:type="dxa" w:w="216"/>
-              <w:right w:type="dxa" w:w="288"/>
+              <w:top w:type="dxa" w:w="0"/>
+              <w:left w:type="dxa" w:w="0"/>
+              <w:bottom w:type="dxa" w:w="0"/>
+              <w:right w:type="dxa" w:w="518"/>
             </w:tcMar>
           </w:tcPr>
           <w:p>
             <w:pPr>
-              <w:spacing w:after="0" w:before="0"/>
+              <w:keepNext w:val="false"/>
+              <w:keepLines/>
+              <w:spacing w:after="200" w:before="120" w:line="240"/>
+              <w:jc w:val="left"/>
             </w:pPr>
             <w:r>
-              <w:rPr>
-                <w:b/>
-                <w:bCs/>
-                <w:color w:val="6E460C"/>
-              </w:rPr>
-              <w:t xml:space="preserve">Note</w:t>
-            </w:r>
-            <w:r>
-              <w:br/>
-              <w:t xml:space="preserve">In a library shared with you as read-only, </w:t>
+              <w:drawing>
+                <wp:inline distT="0" distB="0" distL="0" distR="0">
+                  <wp:extent cx="2619375" cy="3762375"/>
+                  <wp:effectExtent t="19050" r="19050" b="19050" l="19050"/>
+                  <wp:docPr id="17" name="create-menu" descr="The Create menu, open above the file list" title="The Create menu, open above the file list"/>
+                  <wp:cNvGraphicFramePr>
+                    <a:graphicFrameLocks xmlns:a="http://schemas.openxmlformats.org/drawingml/2006/main" noChangeAspect="1"/>
+                  </wp:cNvGraphicFramePr>
+                  <a:graphic xmlns:a="http://schemas.openxmlformats.org/drawingml/2006/main">
+                    <a:graphicData uri="http://schemas.openxmlformats.org/drawingml/2006/picture">
+                      <pic:pic xmlns:pic="http://schemas.openxmlformats.org/drawingml/2006/picture">
+                        <pic:nvPicPr>
+                          <pic:cNvPr id="0" name="" descr=""/>
+                          <pic:cNvPicPr>
+                            <a:picLocks noChangeAspect="1" noChangeArrowheads="1"/>
+                          </pic:cNvPicPr>
+                        </pic:nvPicPr>
+                        <pic:blipFill>
+                          <a:blip r:embed="rId63" cstate="none"/>
+                          <a:srcRect/>
+                          <a:stretch>
+                            <a:fillRect/>
+                          </a:stretch>
+                        </pic:blipFill>
+                        <pic:spPr bwMode="auto">
+                          <a:xfrm>
+                            <a:off x="0" y="0"/>
+                            <a:ext cx="2619375" cy="3762375"/>
+                          </a:xfrm>
+                          <a:prstGeom prst="rect">
+                            <a:avLst/>
+                          </a:prstGeom>
+                          <a:noFill/>
+                          <a:ln w="9525">
+                            <a:solidFill>
+                              <a:srgbClr val="BFC2CA"/>
+                            </a:solidFill>
+                          </a:ln>
+                        </pic:spPr>
+                      </pic:pic>
+                    </a:graphicData>
+                  </a:graphic>
+                </wp:inline>
+              </w:drawing>
+            </w:r>
+          </w:p>
+        </w:tc>
+        <w:tc>
+          <w:tcPr>
+            <w:tcW w:type="dxa" w:w="4724"/>
+            <w:tcBorders>
+              <w:top w:val="none" w:color="FFFFFF" w:sz="0"/>
+              <w:left w:val="none" w:color="FFFFFF" w:sz="0"/>
+              <w:bottom w:val="none" w:color="FFFFFF" w:sz="0"/>
+              <w:right w:val="none" w:color="FFFFFF" w:sz="0"/>
+            </w:tcBorders>
+            <w:tcMar>
+              <w:top w:type="dxa" w:w="144"/>
+              <w:left w:type="dxa" w:w="0"/>
+              <w:bottom w:type="dxa" w:w="0"/>
+              <w:right w:type="dxa" w:w="0"/>
+            </w:tcMar>
+            <w:vAlign w:val="top"/>
+          </w:tcPr>
+          <w:p>
+            <w:pPr>
+              <w:pStyle w:val="ListParagraph"/>
+              <w:keepNext/>
+              <w:keepLines/>
+              <w:numPr>
+                <w:ilvl w:val="0"/>
+                <w:numId w:val="9"/>
+              </w:numPr>
+              <w:spacing w:after="140" w:before="0"/>
+            </w:pPr>
+            <w:r>
+              <w:t xml:space="preserve">Click </w:t>
             </w:r>
             <w:r>
               <w:rPr>
                 <w:b/>
                 <w:bCs/>
               </w:rPr>
-              <w:t xml:space="preserve">Upload</w:t>
-            </w:r>
-            <w:r>
-              <w:t xml:space="preserve"> is hidden. Ask the owner for Read-Write access.</w:t>
-            </w:r>
+              <w:t xml:space="preserve">Create</w:t>
+            </w:r>
+            <w:r>
+              <w:t xml:space="preserve"> above your files.</w:t>
+            </w:r>
+          </w:p>
+          <w:p>
+            <w:pPr>
+              <w:pStyle w:val="ListParagraph"/>
+              <w:keepNext/>
+              <w:keepLines/>
+              <w:numPr>
+                <w:ilvl w:val="0"/>
+                <w:numId w:val="9"/>
+              </w:numPr>
+              <w:spacing w:after="140" w:before="0"/>
+            </w:pPr>
+            <w:r>
+              <w:t xml:space="preserve">Choose </w:t>
+            </w:r>
+            <w:r>
+              <w:rPr>
+                <w:b/>
+                <w:bCs/>
+              </w:rPr>
+              <w:t xml:space="preserve">New folder</w:t>
+            </w:r>
+            <w:r>
+              <w:t xml:space="preserve"> to make a folder.</w:t>
+            </w:r>
+          </w:p>
+          <w:p>
+            <w:pPr>
+              <w:pStyle w:val="ListParagraph"/>
+              <w:keepNext/>
+              <w:keepLines/>
+              <w:numPr>
+                <w:ilvl w:val="0"/>
+                <w:numId w:val="9"/>
+              </w:numPr>
+              <w:spacing w:after="140" w:before="0"/>
+            </w:pPr>
+            <w:r>
+              <w:t xml:space="preserve">Choose </w:t>
+            </w:r>
+            <w:r>
+              <w:rPr>
+                <w:b/>
+                <w:bCs/>
+              </w:rPr>
+              <w:t xml:space="preserve">New Markdown file</w:t>
+            </w:r>
+            <w:r>
+              <w:t xml:space="preserve"> for notes with headings and lists.</w:t>
+            </w:r>
+          </w:p>
+          <w:p>
+            <w:pPr>
+              <w:pStyle w:val="ListParagraph"/>
+              <w:keepNext w:val="false"/>
+              <w:keepLines/>
+              <w:numPr>
+                <w:ilvl w:val="0"/>
+                <w:numId w:val="9"/>
+              </w:numPr>
+              <w:spacing w:after="140" w:before="0"/>
+            </w:pPr>
+            <w:r>
+              <w:t xml:space="preserve">Choose </w:t>
+            </w:r>
+            <w:r>
+              <w:rPr>
+                <w:b/>
+                <w:bCs/>
+              </w:rPr>
+              <w:t xml:space="preserve">New Text file</w:t>
+            </w:r>
+            <w:r>
+              <w:t xml:space="preserve"> for plain text.</w:t>
+            </w:r>
+          </w:p>
+          <w:p>
+            <w:pPr>
+              <w:spacing w:after="60" w:before="0" w:line="240"/>
+            </w:pPr>
+          </w:p>
+          <w:tbl>
+            <w:tblPr>
+              <w:tblW w:type="dxa" w:w="4724"/>
+              <w:tblBorders>
+                <w:top w:val="none" w:color="FFFFFF" w:sz="0"/>
+                <w:left w:val="none" w:color="FFFFFF" w:sz="0"/>
+                <w:bottom w:val="none" w:color="FFFFFF" w:sz="0"/>
+                <w:right w:val="none" w:color="FFFFFF" w:sz="0"/>
+                <w:insideH w:val="none" w:color="FFFFFF" w:sz="0"/>
+                <w:insideV w:val="none" w:color="FFFFFF" w:sz="0"/>
+              </w:tblBorders>
+              <w:tblLayout w:type="fixed"/>
+            </w:tblPr>
+            <w:tblGrid>
+              <w:gridCol w:w="4724"/>
+            </w:tblGrid>
+            <w:tr>
+              <w:trPr>
+                <w:cantSplit/>
+              </w:trPr>
+              <w:tc>
+                <w:tcPr>
+                  <w:tcW w:type="dxa" w:w="4724"/>
+                  <w:tcBorders>
+                    <w:top w:val="none" w:color="FFFFFF" w:sz="0"/>
+                    <w:left w:val="single" w:color="0E6FA8" w:sz="32"/>
+                    <w:bottom w:val="none" w:color="FFFFFF" w:sz="0"/>
+                    <w:right w:val="none" w:color="FFFFFF" w:sz="0"/>
+                  </w:tcBorders>
+                  <w:shd w:fill="E8F2F9" w:color="auto" w:val="clear"/>
+                  <w:tcMar>
+                    <w:top w:type="dxa" w:w="202"/>
+                    <w:left w:type="dxa" w:w="317"/>
+                    <w:bottom w:type="dxa" w:w="216"/>
+                    <w:right w:type="dxa" w:w="288"/>
+                  </w:tcMar>
+                </w:tcPr>
+                <w:p>
+                  <w:pPr>
+                    <w:spacing w:after="0" w:before="0"/>
+                  </w:pPr>
+                  <w:r>
+                    <w:rPr>
+                      <w:b/>
+                      <w:bCs/>
+                      <w:color w:val="0B587F"/>
+                    </w:rPr>
+                    <w:t xml:space="preserve">Tip</w:t>
+                  </w:r>
+                  <w:r>
+                    <w:br/>
+                    <w:t xml:space="preserve">Type a name and click </w:t>
+                  </w:r>
+                  <w:r>
+                    <w:rPr>
+                      <w:b/>
+                      <w:bCs/>
+                    </w:rPr>
+                    <w:t xml:space="preserve">OK</w:t>
+                  </w:r>
+                  <w:r>
+                    <w:t xml:space="preserve">. A new file opens straight away, ready to type into.</w:t>
+                  </w:r>
+                </w:p>
+              </w:tc>
+            </w:tr>
+          </w:tbl>
+          <w:p>
+            <w:pPr>
+              <w:spacing w:after="60" w:before="0" w:line="240"/>
+            </w:pPr>
+          </w:p>
+          <w:tbl>
+            <w:tblPr>
+              <w:tblW w:type="dxa" w:w="4724"/>
+              <w:tblBorders>
+                <w:top w:val="none" w:color="FFFFFF" w:sz="0"/>
+                <w:left w:val="none" w:color="FFFFFF" w:sz="0"/>
+                <w:bottom w:val="none" w:color="FFFFFF" w:sz="0"/>
+                <w:right w:val="none" w:color="FFFFFF" w:sz="0"/>
+                <w:insideH w:val="none" w:color="FFFFFF" w:sz="0"/>
+                <w:insideV w:val="none" w:color="FFFFFF" w:sz="0"/>
+              </w:tblBorders>
+              <w:tblLayout w:type="fixed"/>
+            </w:tblPr>
+            <w:tblGrid>
+              <w:gridCol w:w="4724"/>
+            </w:tblGrid>
+            <w:tr>
+              <w:trPr>
+                <w:cantSplit/>
+              </w:trPr>
+              <w:tc>
+                <w:tcPr>
+                  <w:tcW w:type="dxa" w:w="4724"/>
+                  <w:tcBorders>
+                    <w:top w:val="none" w:color="FFFFFF" w:sz="0"/>
+                    <w:left w:val="single" w:color="9A6212" w:sz="32"/>
+                    <w:bottom w:val="none" w:color="FFFFFF" w:sz="0"/>
+                    <w:right w:val="none" w:color="FFFFFF" w:sz="0"/>
+                  </w:tcBorders>
+                  <w:shd w:fill="FBF3E6" w:color="auto" w:val="clear"/>
+                  <w:tcMar>
+                    <w:top w:type="dxa" w:w="202"/>
+                    <w:left w:type="dxa" w:w="317"/>
+                    <w:bottom w:type="dxa" w:w="216"/>
+                    <w:right w:type="dxa" w:w="288"/>
+                  </w:tcMar>
+                </w:tcPr>
+                <w:p>
+                  <w:pPr>
+                    <w:spacing w:after="0" w:before="0"/>
+                  </w:pPr>
+                  <w:r>
+                    <w:rPr>
+                      <w:b/>
+                      <w:bCs/>
+                      <w:color w:val="6E460C"/>
+                    </w:rPr>
+                    <w:t xml:space="preserve">Note</w:t>
+                  </w:r>
+                  <w:r>
+                    <w:br/>
+                    <w:t xml:space="preserve">If your company has turned on editing in the browser, the menu also offers </w:t>
+                  </w:r>
+                  <w:r>
+                    <w:rPr>
+                      <w:b/>
+                      <w:bCs/>
+                    </w:rPr>
+                    <w:t xml:space="preserve">New Word document</w:t>
+                  </w:r>
+                  <w:r>
+                    <w:t xml:space="preserve"> and </w:t>
+                  </w:r>
+                  <w:r>
+                    <w:rPr>
+                      <w:b/>
+                      <w:bCs/>
+                    </w:rPr>
+                    <w:t xml:space="preserve">New Excel spreadsheet</w:t>
+                  </w:r>
+                  <w:r>
+                    <w:t xml:space="preserve">. In a library shared with you as read-only, </w:t>
+                  </w:r>
+                  <w:r>
+                    <w:rPr>
+                      <w:b/>
+                      <w:bCs/>
+                    </w:rPr>
+                    <w:t xml:space="preserve">Upload</w:t>
+                  </w:r>
+                  <w:r>
+                    <w:t xml:space="preserve"> is hidden and </w:t>
+                  </w:r>
+                  <w:r>
+                    <w:rPr>
+                      <w:b/>
+                      <w:bCs/>
+                    </w:rPr>
+                    <w:t xml:space="preserve">Create</w:t>
+                  </w:r>
+                  <w:r>
+                    <w:t xml:space="preserve"> offers only </w:t>
+                  </w:r>
+                  <w:r>
+                    <w:rPr>
+                      <w:b/>
+                      <w:bCs/>
+                    </w:rPr>
+                    <w:t xml:space="preserve">New library</w:t>
+                  </w:r>
+                  <w:r>
+                    <w:t xml:space="preserve">. Ask the owner for Read-Write access.</w:t>
+                  </w:r>
+                </w:p>
+              </w:tc>
+            </w:tr>
+          </w:tbl>
+          <w:p>
+            <w:pPr>
+              <w:spacing w:after="0" w:before="0"/>
+            </w:pPr>
           </w:p>
         </w:tc>
       </w:tr>
     </w:tbl>
     <w:p>
       <w:pPr>
-        <w:spacing w:after="120" w:before="0" w:line="240"/>
+        <w:spacing w:after="160" w:before="0" w:line="240"/>
+      </w:pPr>
+    </w:p>
+    <w:p>
+      <w:pPr>
+        <w:spacing w:after="200" w:before="0" w:line="240"/>
       </w:pPr>
     </w:p>
     <w:p>
@@ -3936,7 +4196,7 @@
           <wp:inline distT="0" distB="0" distL="0" distR="0">
             <wp:extent cx="5943600" cy="1390650"/>
             <wp:effectExtent t="19050" r="19050" b="19050" l="19050"/>
-            <wp:docPr id="17" name="action-bar" descr="The action bar above a preview, cropped just below the document title" title="The action bar above a preview, cropped just below the document title"/>
+            <wp:docPr id="18" name="action-bar" descr="The action bar above a preview, cropped just below the document title" title="The action bar above a preview, cropped just below the document title"/>
             <wp:cNvGraphicFramePr>
               <a:graphicFrameLocks xmlns:a="http://schemas.openxmlformats.org/drawingml/2006/main" noChangeAspect="1"/>
             </wp:cNvGraphicFramePr>
@@ -3950,7 +4210,7 @@
                     </pic:cNvPicPr>
                   </pic:nvPicPr>
                   <pic:blipFill>
-                    <a:blip r:embed="rId63" cstate="none"/>
+                    <a:blip r:embed="rId64" cstate="none"/>
                     <a:srcRect/>
                     <a:stretch>
                       <a:fillRect/>
@@ -3997,10 +4257,10 @@
           <w:b/>
           <w:bCs/>
         </w:rPr>
-        <w:t xml:space="preserve">Edit</w:t>
-      </w:r>
-      <w:r>
-        <w:t xml:space="preserve"> to change a Word or Excel file in your browser, if your company has turned this on.</w:t>
+        <w:t xml:space="preserve">Word (this computer)</w:t>
+      </w:r>
+      <w:r>
+        <w:t xml:space="preserve"> to open a Word file in Word on your computer and make your changes there. Excel and PowerPoint files get a matching button.</w:t>
       </w:r>
     </w:p>
     <w:p>
@@ -4022,10 +4282,10 @@
           <w:b/>
           <w:bCs/>
         </w:rPr>
-        <w:t xml:space="preserve">Open in ⌄</w:t>
-      </w:r>
-      <w:r>
-        <w:t xml:space="preserve"> for other ways to open it, such as your desktop app.</w:t>
+        <w:t xml:space="preserve">Share</w:t>
+      </w:r>
+      <w:r>
+        <w:t xml:space="preserve"> to send the file to someone.</w:t>
       </w:r>
     </w:p>
     <w:p>
@@ -4047,16 +4307,16 @@
           <w:b/>
           <w:bCs/>
         </w:rPr>
-        <w:t xml:space="preserve">Share</w:t>
-      </w:r>
-      <w:r>
-        <w:t xml:space="preserve"> to send the file to someone.</w:t>
+        <w:t xml:space="preserve">Download</w:t>
+      </w:r>
+      <w:r>
+        <w:t xml:space="preserve"> to save a copy to your computer.</w:t>
       </w:r>
     </w:p>
     <w:p>
       <w:pPr>
         <w:pStyle w:val="ListParagraph"/>
-        <w:keepNext/>
+        <w:keepNext w:val="false"/>
         <w:keepLines/>
         <w:numPr>
           <w:ilvl w:val="0"/>
@@ -4072,65 +4332,123 @@
           <w:b/>
           <w:bCs/>
         </w:rPr>
-        <w:t xml:space="preserve">Download</w:t>
-      </w:r>
-      <w:r>
-        <w:t xml:space="preserve"> to save a copy to your computer.</w:t>
+        <w:t xml:space="preserve">Details</w:t>
+      </w:r>
+      <w:r>
+        <w:t xml:space="preserve"> to see who added it, when it changed and where it is kept.</w:t>
+      </w:r>
+    </w:p>
+    <w:p>
+      <w:pPr>
+        <w:spacing w:after="60" w:before="0" w:line="240"/>
+      </w:pPr>
+    </w:p>
+    <w:tbl>
+      <w:tblPr>
+        <w:tblW w:type="dxa" w:w="9360"/>
+        <w:tblBorders>
+          <w:top w:val="none" w:color="FFFFFF" w:sz="0"/>
+          <w:left w:val="none" w:color="FFFFFF" w:sz="0"/>
+          <w:bottom w:val="none" w:color="FFFFFF" w:sz="0"/>
+          <w:right w:val="none" w:color="FFFFFF" w:sz="0"/>
+          <w:insideH w:val="none" w:color="FFFFFF" w:sz="0"/>
+          <w:insideV w:val="none" w:color="FFFFFF" w:sz="0"/>
+        </w:tblBorders>
+        <w:tblLayout w:type="fixed"/>
+      </w:tblPr>
+      <w:tblGrid>
+        <w:gridCol w:w="9360"/>
+      </w:tblGrid>
+      <w:tr>
+        <w:trPr>
+          <w:cantSplit/>
+        </w:trPr>
+        <w:tc>
+          <w:tcPr>
+            <w:tcW w:type="dxa" w:w="9360"/>
+            <w:tcBorders>
+              <w:top w:val="none" w:color="FFFFFF" w:sz="0"/>
+              <w:left w:val="single" w:color="9A6212" w:sz="32"/>
+              <w:bottom w:val="none" w:color="FFFFFF" w:sz="0"/>
+              <w:right w:val="none" w:color="FFFFFF" w:sz="0"/>
+            </w:tcBorders>
+            <w:shd w:fill="FBF3E6" w:color="auto" w:val="clear"/>
+            <w:tcMar>
+              <w:top w:type="dxa" w:w="202"/>
+              <w:left w:type="dxa" w:w="317"/>
+              <w:bottom w:type="dxa" w:w="216"/>
+              <w:right w:type="dxa" w:w="288"/>
+            </w:tcMar>
+          </w:tcPr>
+          <w:p>
+            <w:pPr>
+              <w:spacing w:after="0" w:before="0"/>
+            </w:pPr>
+            <w:r>
+              <w:rPr>
+                <w:b/>
+                <w:bCs/>
+                <w:color w:val="6E460C"/>
+              </w:rPr>
+              <w:t xml:space="preserve">Note</w:t>
+            </w:r>
+            <w:r>
+              <w:br/>
+              <w:t xml:space="preserve">If your company has turned on editing in the browser, the first button is </w:t>
+            </w:r>
+            <w:r>
+              <w:rPr>
+                <w:b/>
+                <w:bCs/>
+              </w:rPr>
+              <w:t xml:space="preserve">Edit</w:t>
+            </w:r>
+            <w:r>
+              <w:t xml:space="preserve"> instead, and an </w:t>
+            </w:r>
+            <w:r>
+              <w:rPr>
+                <w:b/>
+                <w:bCs/>
+              </w:rPr>
+              <w:t xml:space="preserve">Open in ⌄</w:t>
+            </w:r>
+            <w:r>
+              <w:t xml:space="preserve"> button beside it offers both ways of opening the file.</w:t>
+            </w:r>
+          </w:p>
+        </w:tc>
+      </w:tr>
+    </w:tbl>
+    <w:p>
+      <w:pPr>
+        <w:spacing w:after="200" w:before="0" w:line="240"/>
+      </w:pPr>
+    </w:p>
+    <w:p>
+      <w:pPr>
+        <w:pStyle w:val="Heading2"/>
+      </w:pPr>
+      <w:r>
+        <w:rPr>
+          <w:b/>
+          <w:bCs/>
+        </w:rPr>
+        <w:t xml:space="preserve">What you can preview</w:t>
+      </w:r>
+    </w:p>
+    <w:p>
+      <w:pPr>
+        <w:keepNext/>
+      </w:pPr>
+      <w:r>
+        <w:t xml:space="preserve">These files open right inside Depot, without downloading them:</w:t>
       </w:r>
     </w:p>
     <w:p>
       <w:pPr>
         <w:pStyle w:val="ListParagraph"/>
-        <w:keepNext w:val="false"/>
-        <w:keepLines/>
-        <w:numPr>
-          <w:ilvl w:val="0"/>
-          <w:numId w:val="10"/>
-        </w:numPr>
-        <w:spacing w:after="140" w:before="0"/>
-      </w:pPr>
-      <w:r>
-        <w:t xml:space="preserve">Click </w:t>
-      </w:r>
-      <w:r>
-        <w:rPr>
-          <w:b/>
-          <w:bCs/>
-        </w:rPr>
-        <w:t xml:space="preserve">Details</w:t>
-      </w:r>
-      <w:r>
-        <w:t xml:space="preserve"> to see who added it, when it changed and where it is kept.</w:t>
-      </w:r>
-    </w:p>
-    <w:p>
-      <w:pPr>
-        <w:spacing w:after="200" w:before="0" w:line="240"/>
-      </w:pPr>
-    </w:p>
-    <w:p>
-      <w:pPr>
-        <w:pStyle w:val="Heading2"/>
-      </w:pPr>
-      <w:r>
-        <w:rPr>
-          <w:b/>
-          <w:bCs/>
-        </w:rPr>
-        <w:t xml:space="preserve">What you can preview</w:t>
-      </w:r>
-    </w:p>
-    <w:p>
-      <w:pPr>
-        <w:keepNext w:val="false"/>
-      </w:pPr>
-      <w:r>
-        <w:t xml:space="preserve">These files open right inside Depot, without downloading them:</w:t>
-      </w:r>
-    </w:p>
-    <w:p>
-      <w:pPr>
-        <w:pStyle w:val="ListParagraph"/>
+        <w:keepNext/>
         <w:keepLines/>
         <w:numPr>
           <w:ilvl w:val="0"/>
@@ -4145,6 +4463,7 @@
     <w:p>
       <w:pPr>
         <w:pStyle w:val="ListParagraph"/>
+        <w:keepNext/>
         <w:keepLines/>
         <w:numPr>
           <w:ilvl w:val="0"/>
@@ -4159,6 +4478,7 @@
     <w:p>
       <w:pPr>
         <w:pStyle w:val="ListParagraph"/>
+        <w:keepNext w:val="false"/>
         <w:keepLines/>
         <w:numPr>
           <w:ilvl w:val="0"/>
@@ -4167,7 +4487,7 @@
         <w:spacing w:after="100" w:before="0"/>
       </w:pPr>
       <w:r>
-        <w:t xml:space="preserve">Text and code files, shown with line numbers.</w:t>
+        <w:t xml:space="preserve">Text, Markdown, CSV, JSON and log files, shown with line numbers.</w:t>
       </w:r>
     </w:p>
     <w:p>
@@ -4373,7 +4693,7 @@
           <wp:inline distT="0" distB="0" distL="0" distR="0">
             <wp:extent cx="5943600" cy="3838575"/>
             <wp:effectExtent t="19050" r="19050" b="19050" l="19050"/>
-            <wp:docPr id="18" name="selection-bar" descr="Two files selected, with the selection bar above the list" title="Two files selected, with the selection bar above the list"/>
+            <wp:docPr id="19" name="selection-bar" descr="Two files selected, with the selection bar above the list" title="Two files selected, with the selection bar above the list"/>
             <wp:cNvGraphicFramePr>
               <a:graphicFrameLocks xmlns:a="http://schemas.openxmlformats.org/drawingml/2006/main" noChangeAspect="1"/>
             </wp:cNvGraphicFramePr>
@@ -4387,7 +4707,7 @@
                     </pic:cNvPicPr>
                   </pic:nvPicPr>
                   <pic:blipFill>
-                    <a:blip r:embed="rId64" cstate="none"/>
+                    <a:blip r:embed="rId65" cstate="none"/>
                     <a:srcRect/>
                     <a:stretch>
                       <a:fillRect/>
@@ -4477,7 +4797,7 @@
         <w:t xml:space="preserve">Move to library…</w:t>
       </w:r>
       <w:r>
-        <w:t xml:space="preserve"> to move the selected files, not folders, to another library.</w:t>
+        <w:t xml:space="preserve"> to move everything you selected to another library.</w:t>
       </w:r>
     </w:p>
     <w:p>
@@ -4575,6 +4895,7 @@
     <w:p>
       <w:pPr>
         <w:pStyle w:val="ListParagraph"/>
+        <w:keepNext w:val="false"/>
         <w:keepLines/>
         <w:numPr>
           <w:ilvl w:val="0"/>
@@ -4599,6 +4920,7 @@
     <w:p>
       <w:pPr>
         <w:pStyle w:val="ListParagraph"/>
+        <w:keepNext w:val="false"/>
         <w:keepLines/>
         <w:numPr>
           <w:ilvl w:val="0"/>
@@ -4647,7 +4969,7 @@
           <wp:inline distT="0" distB="0" distL="0" distR="0">
             <wp:extent cx="3171825" cy="914400"/>
             <wp:effectExtent t="19050" r="19050" b="19050" l="19050"/>
-            <wp:docPr id="19" name="delete-undo" descr="The Undo toast after deleting two files" title="The Undo toast after deleting two files"/>
+            <wp:docPr id="20" name="delete-undo" descr="The Undo toast after deleting two files" title="The Undo toast after deleting two files"/>
             <wp:cNvGraphicFramePr>
               <a:graphicFrameLocks xmlns:a="http://schemas.openxmlformats.org/drawingml/2006/main" noChangeAspect="1"/>
             </wp:cNvGraphicFramePr>
@@ -4661,7 +4983,7 @@
                     </pic:cNvPicPr>
                   </pic:nvPicPr>
                   <pic:blipFill>
-                    <a:blip r:embed="rId65" cstate="none"/>
+                    <a:blip r:embed="rId66" cstate="none"/>
                     <a:srcRect/>
                     <a:stretch>
                       <a:fillRect/>
@@ -4717,6 +5039,7 @@
     <w:p>
       <w:pPr>
         <w:pStyle w:val="ListParagraph"/>
+        <w:keepNext w:val="false"/>
         <w:keepLines/>
         <w:numPr>
           <w:ilvl w:val="0"/>
@@ -4751,6 +5074,7 @@
     <w:p>
       <w:pPr>
         <w:pStyle w:val="ListParagraph"/>
+        <w:keepNext w:val="false"/>
         <w:keepLines/>
         <w:numPr>
           <w:ilvl w:val="0"/>
@@ -4854,6 +5178,7 @@
     <w:p>
       <w:pPr>
         <w:pStyle w:val="ListParagraph"/>
+        <w:keepNext/>
         <w:keepLines/>
         <w:numPr>
           <w:ilvl w:val="0"/>
@@ -4888,6 +5213,7 @@
     <w:p>
       <w:pPr>
         <w:pStyle w:val="ListParagraph"/>
+        <w:keepNext/>
         <w:keepLines/>
         <w:numPr>
           <w:ilvl w:val="0"/>
@@ -4932,6 +5258,7 @@
     <w:p>
       <w:pPr>
         <w:pStyle w:val="ListParagraph"/>
+        <w:keepNext w:val="false"/>
         <w:keepLines/>
         <w:numPr>
           <w:ilvl w:val="0"/>
@@ -5104,7 +5431,7 @@
           <wp:inline distT="0" distB="0" distL="0" distR="0">
             <wp:extent cx="5943600" cy="4019550"/>
             <wp:effectExtent t="19050" r="19050" b="19050" l="19050"/>
-            <wp:docPr id="20" name="share-people" descr="Choosing who gets the file and what they can do" title="Choosing who gets the file and what they can do"/>
+            <wp:docPr id="21" name="share-people" descr="Choosing who gets the file and what they can do" title="Choosing who gets the file and what they can do"/>
             <wp:cNvGraphicFramePr>
               <a:graphicFrameLocks xmlns:a="http://schemas.openxmlformats.org/drawingml/2006/main" noChangeAspect="1"/>
             </wp:cNvGraphicFramePr>
@@ -5118,7 +5445,7 @@
                     </pic:cNvPicPr>
                   </pic:nvPicPr>
                   <pic:blipFill>
-                    <a:blip r:embed="rId66" cstate="none"/>
+                    <a:blip r:embed="rId67" cstate="none"/>
                     <a:srcRect/>
                     <a:stretch>
                       <a:fillRect/>
@@ -5290,7 +5617,7 @@
           <wp:inline distT="0" distB="0" distL="0" distR="0">
             <wp:extent cx="4210050" cy="4210050"/>
             <wp:effectExtent t="19050" r="19050" b="19050" l="19050"/>
-            <wp:docPr id="21" name="share-lock" descr="Setting an expiry date, a password, and sending the invite" title="Setting an expiry date, a password, and sending the invite"/>
+            <wp:docPr id="22" name="share-lock" descr="Setting an expiry date, a password, and sending the invite" title="Setting an expiry date, a password, and sending the invite"/>
             <wp:cNvGraphicFramePr>
               <a:graphicFrameLocks xmlns:a="http://schemas.openxmlformats.org/drawingml/2006/main" noChangeAspect="1"/>
             </wp:cNvGraphicFramePr>
@@ -5304,7 +5631,7 @@
                     </pic:cNvPicPr>
                   </pic:nvPicPr>
                   <pic:blipFill>
-                    <a:blip r:embed="rId67" cstate="none"/>
+                    <a:blip r:embed="rId68" cstate="none"/>
                     <a:srcRect/>
                     <a:stretch>
                       <a:fillRect/>
@@ -5524,6 +5851,7 @@
     <w:p>
       <w:pPr>
         <w:pStyle w:val="ListParagraph"/>
+        <w:keepNext/>
         <w:keepLines/>
         <w:numPr>
           <w:ilvl w:val="0"/>
@@ -5548,6 +5876,7 @@
     <w:p>
       <w:pPr>
         <w:pStyle w:val="ListParagraph"/>
+        <w:keepNext/>
         <w:keepLines/>
         <w:numPr>
           <w:ilvl w:val="0"/>
@@ -5562,6 +5891,7 @@
     <w:p>
       <w:pPr>
         <w:pStyle w:val="ListParagraph"/>
+        <w:keepNext/>
         <w:keepLines/>
         <w:numPr>
           <w:ilvl w:val="0"/>
@@ -5576,6 +5906,7 @@
     <w:p>
       <w:pPr>
         <w:pStyle w:val="ListParagraph"/>
+        <w:keepNext w:val="false"/>
         <w:keepLines/>
         <w:numPr>
           <w:ilvl w:val="0"/>
@@ -5616,7 +5947,7 @@
           <wp:inline distT="0" distB="0" distL="0" distR="0">
             <wp:extent cx="5943600" cy="2809875"/>
             <wp:effectExtent t="19050" r="19050" b="19050" l="19050"/>
-            <wp:docPr id="22" name="share-access" descr="Seeing who has access to the file, and revoking a link" title="Seeing who has access to the file, and revoking a link"/>
+            <wp:docPr id="23" name="share-access" descr="Seeing who has access to the file, and revoking a link" title="Seeing who has access to the file, and revoking a link"/>
             <wp:cNvGraphicFramePr>
               <a:graphicFrameLocks xmlns:a="http://schemas.openxmlformats.org/drawingml/2006/main" noChangeAspect="1"/>
             </wp:cNvGraphicFramePr>
@@ -5630,7 +5961,7 @@
                     </pic:cNvPicPr>
                   </pic:nvPicPr>
                   <pic:blipFill>
-                    <a:blip r:embed="rId68" cstate="none"/>
+                    <a:blip r:embed="rId69" cstate="none"/>
                     <a:srcRect/>
                     <a:stretch>
                       <a:fillRect/>
@@ -5841,7 +6172,7 @@
           <wp:inline distT="0" distB="0" distL="0" distR="0">
             <wp:extent cx="5943600" cy="771525"/>
             <wp:effectExtent t="19050" r="19050" b="19050" l="19050"/>
-            <wp:docPr id="23" name="open" descr="Pointing to a folder row to reveal its Share icon" title="Pointing to a folder row to reveal its Share icon"/>
+            <wp:docPr id="24" name="open" descr="Pointing to a folder row to reveal its Share icon" title="Pointing to a folder row to reveal its Share icon"/>
             <wp:cNvGraphicFramePr>
               <a:graphicFrameLocks xmlns:a="http://schemas.openxmlformats.org/drawingml/2006/main" noChangeAspect="1"/>
             </wp:cNvGraphicFramePr>
@@ -5855,7 +6186,7 @@
                     </pic:cNvPicPr>
                   </pic:nvPicPr>
                   <pic:blipFill>
-                    <a:blip r:embed="rId69" cstate="none"/>
+                    <a:blip r:embed="rId70" cstate="none"/>
                     <a:srcRect/>
                     <a:stretch>
                       <a:fillRect/>
@@ -6099,7 +6430,7 @@
           <wp:inline distT="0" distB="0" distL="0" distR="0">
             <wp:extent cx="5943600" cy="2781300"/>
             <wp:effectExtent t="19050" r="19050" b="19050" l="19050"/>
-            <wp:docPr id="24" name="anyone-link" descr="The Anyone with the link section, with one link already active" title="The Anyone with the link section, with one link already active"/>
+            <wp:docPr id="25" name="anyone-link" descr="The Anyone with the link section, with one link already active" title="The Anyone with the link section, with one link already active"/>
             <wp:cNvGraphicFramePr>
               <a:graphicFrameLocks xmlns:a="http://schemas.openxmlformats.org/drawingml/2006/main" noChangeAspect="1"/>
             </wp:cNvGraphicFramePr>
@@ -6113,7 +6444,7 @@
                     </pic:cNvPicPr>
                   </pic:nvPicPr>
                   <pic:blipFill>
-                    <a:blip r:embed="rId70" cstate="none"/>
+                    <a:blip r:embed="rId71" cstate="none"/>
                     <a:srcRect/>
                     <a:stretch>
                       <a:fillRect/>
@@ -6273,7 +6604,7 @@
           <wp:inline distT="0" distB="0" distL="0" distR="0">
             <wp:extent cx="5867400" cy="4210050"/>
             <wp:effectExtent t="19050" r="19050" b="19050" l="19050"/>
-            <wp:docPr id="25" name="send-to-people" descr="The Send to people section, filled in" title="The Send to people section, filled in"/>
+            <wp:docPr id="26" name="send-to-people" descr="The Send to people section, filled in" title="The Send to people section, filled in"/>
             <wp:cNvGraphicFramePr>
               <a:graphicFrameLocks xmlns:a="http://schemas.openxmlformats.org/drawingml/2006/main" noChangeAspect="1"/>
             </wp:cNvGraphicFramePr>
@@ -6287,7 +6618,7 @@
                     </pic:cNvPicPr>
                   </pic:nvPicPr>
                   <pic:blipFill>
-                    <a:blip r:embed="rId71" cstate="none"/>
+                    <a:blip r:embed="rId72" cstate="none"/>
                     <a:srcRect/>
                     <a:stretch>
                       <a:fillRect/>
@@ -6655,7 +6986,7 @@
           <wp:inline distT="0" distB="0" distL="0" distR="0">
             <wp:extent cx="5943600" cy="1943100"/>
             <wp:effectExtent t="19050" r="19050" b="19050" l="19050"/>
-            <wp:docPr id="26" name="overview" descr="My links: the status chips, and the links you have made" title="My links: the status chips, and the links you have made"/>
+            <wp:docPr id="27" name="overview" descr="My links: the status chips, and the links you have made" title="My links: the status chips, and the links you have made"/>
             <wp:cNvGraphicFramePr>
               <a:graphicFrameLocks xmlns:a="http://schemas.openxmlformats.org/drawingml/2006/main" noChangeAspect="1"/>
             </wp:cNvGraphicFramePr>
@@ -6669,7 +7000,7 @@
                     </pic:cNvPicPr>
                   </pic:nvPicPr>
                   <pic:blipFill>
-                    <a:blip r:embed="rId72" cstate="none"/>
+                    <a:blip r:embed="rId73" cstate="none"/>
                     <a:srcRect/>
                     <a:stretch>
                       <a:fillRect/>
@@ -6740,6 +7071,7 @@
     <w:p>
       <w:pPr>
         <w:pStyle w:val="ListParagraph"/>
+        <w:keepNext w:val="false"/>
         <w:keepLines/>
         <w:numPr>
           <w:ilvl w:val="0"/>
@@ -6761,6 +7093,7 @@
     <w:p>
       <w:pPr>
         <w:pStyle w:val="ListParagraph"/>
+        <w:keepNext w:val="false"/>
         <w:keepLines/>
         <w:numPr>
           <w:ilvl w:val="0"/>
@@ -6782,6 +7115,7 @@
     <w:p>
       <w:pPr>
         <w:pStyle w:val="ListParagraph"/>
+        <w:keepNext w:val="false"/>
         <w:keepLines/>
         <w:numPr>
           <w:ilvl w:val="0"/>
@@ -6803,6 +7137,7 @@
     <w:p>
       <w:pPr>
         <w:pStyle w:val="ListParagraph"/>
+        <w:keepNext w:val="false"/>
         <w:keepLines/>
         <w:numPr>
           <w:ilvl w:val="0"/>
@@ -6824,6 +7159,7 @@
     <w:p>
       <w:pPr>
         <w:pStyle w:val="ListParagraph"/>
+        <w:keepNext w:val="false"/>
         <w:keepLines/>
         <w:numPr>
           <w:ilvl w:val="0"/>
@@ -6933,7 +7269,7 @@
           <wp:inline distT="0" distB="0" distL="0" distR="0">
             <wp:extent cx="4391025" cy="2314575"/>
             <wp:effectExtent t="19050" r="19050" b="19050" l="19050"/>
-            <wp:docPr id="27" name="revoke" descr="Confirming that you want to revoke a link" title="Confirming that you want to revoke a link"/>
+            <wp:docPr id="28" name="revoke" descr="Confirming that you want to revoke a link" title="Confirming that you want to revoke a link"/>
             <wp:cNvGraphicFramePr>
               <a:graphicFrameLocks xmlns:a="http://schemas.openxmlformats.org/drawingml/2006/main" noChangeAspect="1"/>
             </wp:cNvGraphicFramePr>
@@ -6947,7 +7283,7 @@
                     </pic:cNvPicPr>
                   </pic:nvPicPr>
                   <pic:blipFill>
-                    <a:blip r:embed="rId73" cstate="none"/>
+                    <a:blip r:embed="rId74" cstate="none"/>
                     <a:srcRect/>
                     <a:stretch>
                       <a:fillRect/>
@@ -7092,6 +7428,7 @@
     <w:p>
       <w:pPr>
         <w:pStyle w:val="ListParagraph"/>
+        <w:keepNext/>
         <w:keepLines/>
         <w:numPr>
           <w:ilvl w:val="0"/>
@@ -7116,6 +7453,7 @@
     <w:p>
       <w:pPr>
         <w:pStyle w:val="ListParagraph"/>
+        <w:keepNext w:val="false"/>
         <w:keepLines/>
         <w:numPr>
           <w:ilvl w:val="0"/>
@@ -7268,7 +7606,7 @@
           <wp:inline distT="0" distB="0" distL="0" distR="0">
             <wp:extent cx="4210050" cy="866775"/>
             <wp:effectExtent t="19050" r="19050" b="19050" l="19050"/>
-            <wp:docPr id="28" name="file-bell" descr="Hovering a file to find its follow bell, next to its other row icons" title="Hovering a file to find its follow bell, next to its other row icons"/>
+            <wp:docPr id="29" name="file-bell" descr="Hovering a file to find its follow bell, next to its other row icons" title="Hovering a file to find its follow bell, next to its other row icons"/>
             <wp:cNvGraphicFramePr>
               <a:graphicFrameLocks xmlns:a="http://schemas.openxmlformats.org/drawingml/2006/main" noChangeAspect="1"/>
             </wp:cNvGraphicFramePr>
@@ -7282,7 +7620,7 @@
                     </pic:cNvPicPr>
                   </pic:nvPicPr>
                   <pic:blipFill>
-                    <a:blip r:embed="rId74" cstate="none"/>
+                    <a:blip r:embed="rId75" cstate="none"/>
                     <a:srcRect/>
                     <a:stretch>
                       <a:fillRect/>
@@ -7391,7 +7729,7 @@
             </w:r>
             <w:r>
               <w:br/>
-              <w:t xml:space="preserve">Depot now tells you when someone edits the file, or downloads it from a link.</w:t>
+              <w:t xml:space="preserve">Depot now tells you when someone downloads the file from a link. If your company has turned on editing in the browser, it also tells you when someone edits it.</w:t>
             </w:r>
           </w:p>
         </w:tc>
@@ -7444,7 +7782,7 @@
           <wp:inline distT="0" distB="0" distL="0" distR="0">
             <wp:extent cx="3943350" cy="3200400"/>
             <wp:effectExtent t="19050" r="19050" b="19050" l="19050"/>
-            <wp:docPr id="29" name="notif-panel" descr="The Notifications panel, newest first" title="The Notifications panel, newest first"/>
+            <wp:docPr id="30" name="notif-panel" descr="The Notifications panel, newest first" title="The Notifications panel, newest first"/>
             <wp:cNvGraphicFramePr>
               <a:graphicFrameLocks xmlns:a="http://schemas.openxmlformats.org/drawingml/2006/main" noChangeAspect="1"/>
             </wp:cNvGraphicFramePr>
@@ -7458,7 +7796,7 @@
                     </pic:cNvPicPr>
                   </pic:nvPicPr>
                   <pic:blipFill>
-                    <a:blip r:embed="rId75" cstate="none"/>
+                    <a:blip r:embed="rId76" cstate="none"/>
                     <a:srcRect/>
                     <a:stretch>
                       <a:fillRect/>
@@ -7529,6 +7867,7 @@
     <w:p>
       <w:pPr>
         <w:pStyle w:val="ListParagraph"/>
+        <w:keepNext w:val="false"/>
         <w:keepLines/>
         <w:numPr>
           <w:ilvl w:val="0"/>
@@ -7543,6 +7882,7 @@
     <w:p>
       <w:pPr>
         <w:pStyle w:val="ListParagraph"/>
+        <w:keepNext w:val="false"/>
         <w:keepLines/>
         <w:numPr>
           <w:ilvl w:val="0"/>
@@ -7551,7 +7891,7 @@
         <w:spacing w:after="100" w:before="0"/>
       </w:pPr>
       <w:r>
-        <w:t xml:space="preserve">They also tell you when you are given access to something, or a file you follow is edited.</w:t>
+        <w:t xml:space="preserve">They also tell you when you are given access to something.</w:t>
       </w:r>
     </w:p>
     <w:p>
@@ -7591,7 +7931,7 @@
           <wp:inline distT="0" distB="0" distL="0" distR="0">
             <wp:extent cx="5943600" cy="1390650"/>
             <wp:effectExtent t="19050" r="19050" b="19050" l="19050"/>
-            <wp:docPr id="30" name="folder-notifications" descr="A folder you own already notifies you of new files, and its menu can turn that off" title="A folder you own already notifies you of new files, and its menu can turn that off"/>
+            <wp:docPr id="31" name="folder-notifications" descr="A folder you own already notifies you of new files, and its menu can turn that off" title="A folder you own already notifies you of new files, and its menu can turn that off"/>
             <wp:cNvGraphicFramePr>
               <a:graphicFrameLocks xmlns:a="http://schemas.openxmlformats.org/drawingml/2006/main" noChangeAspect="1"/>
             </wp:cNvGraphicFramePr>
@@ -7605,7 +7945,7 @@
                     </pic:cNvPicPr>
                   </pic:nvPicPr>
                   <pic:blipFill>
-                    <a:blip r:embed="rId76" cstate="none"/>
+                    <a:blip r:embed="rId77" cstate="none"/>
                     <a:srcRect/>
                     <a:stretch>
                       <a:fillRect/>
@@ -7735,7 +8075,7 @@
           <wp:inline distT="0" distB="0" distL="0" distR="0">
             <wp:extent cx="5943600" cy="2952750"/>
             <wp:effectExtent t="19050" r="19050" b="19050" l="19050"/>
-            <wp:docPr id="31" name="settings-notifications" descr="Settings, Notifications: the bell and presence alerts" title="Settings, Notifications: the bell and presence alerts"/>
+            <wp:docPr id="32" name="settings-notifications" descr="Settings, Notifications: the bell and presence alerts" title="Settings, Notifications: the bell and presence alerts"/>
             <wp:cNvGraphicFramePr>
               <a:graphicFrameLocks xmlns:a="http://schemas.openxmlformats.org/drawingml/2006/main" noChangeAspect="1"/>
             </wp:cNvGraphicFramePr>
@@ -7749,7 +8089,7 @@
                     </pic:cNvPicPr>
                   </pic:nvPicPr>
                   <pic:blipFill>
-                    <a:blip r:embed="rId77" cstate="none"/>
+                    <a:blip r:embed="rId78" cstate="none"/>
                     <a:srcRect/>
                     <a:stretch>
                       <a:fillRect/>
@@ -7892,7 +8232,7 @@
           <wp:inline distT="0" distB="0" distL="0" distR="0">
             <wp:extent cx="5943600" cy="2085975"/>
             <wp:effectExtent t="19050" r="19050" b="19050" l="19050"/>
-            <wp:docPr id="32" name="email-notices" descr="Settings, Notifications: the list of notices Depot emails to you" title="Settings, Notifications: the list of notices Depot emails to you"/>
+            <wp:docPr id="33" name="email-notices" descr="Settings, Notifications: the list of notices Depot emails to you" title="Settings, Notifications: the list of notices Depot emails to you"/>
             <wp:cNvGraphicFramePr>
               <a:graphicFrameLocks xmlns:a="http://schemas.openxmlformats.org/drawingml/2006/main" noChangeAspect="1"/>
             </wp:cNvGraphicFramePr>
@@ -7906,7 +8246,7 @@
                     </pic:cNvPicPr>
                   </pic:nvPicPr>
                   <pic:blipFill>
-                    <a:blip r:embed="rId78" cstate="none"/>
+                    <a:blip r:embed="rId79" cstate="none"/>
                     <a:srcRect/>
                     <a:stretch>
                       <a:fillRect/>
@@ -7952,6 +8292,7 @@
     <w:p>
       <w:pPr>
         <w:pStyle w:val="ListParagraph"/>
+        <w:keepNext w:val="false"/>
         <w:keepLines/>
         <w:numPr>
           <w:ilvl w:val="0"/>
@@ -7966,6 +8307,7 @@
     <w:p>
       <w:pPr>
         <w:pStyle w:val="ListParagraph"/>
+        <w:keepNext w:val="false"/>
         <w:keepLines/>
         <w:numPr>
           <w:ilvl w:val="0"/>
@@ -7980,6 +8322,7 @@
     <w:p>
       <w:pPr>
         <w:pStyle w:val="ListParagraph"/>
+        <w:keepNext w:val="false"/>
         <w:keepLines/>
         <w:numPr>
           <w:ilvl w:val="0"/>
@@ -7994,6 +8337,7 @@
     <w:p>
       <w:pPr>
         <w:pStyle w:val="ListParagraph"/>
+        <w:keepNext w:val="false"/>
         <w:keepLines/>
         <w:numPr>
           <w:ilvl w:val="0"/>
@@ -8002,7 +8346,7 @@
         <w:spacing w:after="100" w:before="0"/>
       </w:pPr>
       <w:r>
-        <w:t xml:space="preserve">A file you follow is edited.</w:t>
+        <w:t xml:space="preserve">A file you follow is edited in the browser, if your company has turned that on.</w:t>
       </w:r>
     </w:p>
     <w:p>
@@ -8225,7 +8569,7 @@
           <wp:inline distT="0" distB="0" distL="0" distR="0">
             <wp:extent cx="5943600" cy="2524125"/>
             <wp:effectExtent t="19050" r="19050" b="19050" l="19050"/>
-            <wp:docPr id="33" name="search-scope" descr="The scope button open: Auto, Contents, File names and Ask AI" title="The scope button open: Auto, Contents, File names and Ask AI"/>
+            <wp:docPr id="34" name="search-scope" descr="The scope button open: Auto, Contents, File names and Ask AI" title="The scope button open: Auto, Contents, File names and Ask AI"/>
             <wp:cNvGraphicFramePr>
               <a:graphicFrameLocks xmlns:a="http://schemas.openxmlformats.org/drawingml/2006/main" noChangeAspect="1"/>
             </wp:cNvGraphicFramePr>
@@ -8239,7 +8583,7 @@
                     </pic:cNvPicPr>
                   </pic:nvPicPr>
                   <pic:blipFill>
-                    <a:blip r:embed="rId79" cstate="none"/>
+                    <a:blip r:embed="rId80" cstate="none"/>
                     <a:srcRect/>
                     <a:stretch>
                       <a:fillRect/>
@@ -8439,7 +8783,7 @@
           <wp:inline distT="0" distB="0" distL="0" distR="0">
             <wp:extent cx="5943600" cy="3676650"/>
             <wp:effectExtent t="19050" r="19050" b="19050" l="19050"/>
-            <wp:docPr id="34" name="ask-window" descr="The Ask window: it repeats the question, then answers underneath" title="The Ask window: it repeats the question, then answers underneath"/>
+            <wp:docPr id="35" name="ask-window" descr="The Ask window: it repeats the question, then answers underneath" title="The Ask window: it repeats the question, then answers underneath"/>
             <wp:cNvGraphicFramePr>
               <a:graphicFrameLocks xmlns:a="http://schemas.openxmlformats.org/drawingml/2006/main" noChangeAspect="1"/>
             </wp:cNvGraphicFramePr>
@@ -8453,7 +8797,7 @@
                     </pic:cNvPicPr>
                   </pic:nvPicPr>
                   <pic:blipFill>
-                    <a:blip r:embed="rId80" cstate="none"/>
+                    <a:blip r:embed="rId81" cstate="none"/>
                     <a:srcRect/>
                     <a:stretch>
                       <a:fillRect/>
@@ -8761,7 +9105,7 @@
           <wp:inline distT="0" distB="0" distL="0" distR="0">
             <wp:extent cx="5943600" cy="1343025"/>
             <wp:effectExtent t="19050" r="19050" b="19050" l="19050"/>
-            <wp:docPr id="35" name="shared-with-me" descr="The Shared with me page: the Libraries table, and Shared with me in the left rail" title="The Shared with me page: the Libraries table, and Shared with me in the left rail"/>
+            <wp:docPr id="36" name="shared-with-me" descr="The Shared with me page: the Libraries table, and Shared with me in the left rail" title="The Shared with me page: the Libraries table, and Shared with me in the left rail"/>
             <wp:cNvGraphicFramePr>
               <a:graphicFrameLocks xmlns:a="http://schemas.openxmlformats.org/drawingml/2006/main" noChangeAspect="1"/>
             </wp:cNvGraphicFramePr>
@@ -8775,7 +9119,7 @@
                     </pic:cNvPicPr>
                   </pic:nvPicPr>
                   <pic:blipFill>
-                    <a:blip r:embed="rId81" cstate="none"/>
+                    <a:blip r:embed="rId82" cstate="none"/>
                     <a:srcRect/>
                     <a:stretch>
                       <a:fillRect/>
@@ -8882,7 +9226,7 @@
           <wp:inline distT="0" distB="0" distL="0" distR="0">
             <wp:extent cx="4210050" cy="981075"/>
             <wp:effectExtent t="19050" r="19050" b="19050" l="19050"/>
-            <wp:docPr id="36" name="star-row" descr="Pointing to a file to reveal the star on its row" title="Pointing to a file to reveal the star on its row"/>
+            <wp:docPr id="37" name="star-row" descr="Pointing to a file to reveal the star on its row" title="Pointing to a file to reveal the star on its row"/>
             <wp:cNvGraphicFramePr>
               <a:graphicFrameLocks xmlns:a="http://schemas.openxmlformats.org/drawingml/2006/main" noChangeAspect="1"/>
             </wp:cNvGraphicFramePr>
@@ -8896,7 +9240,7 @@
                     </pic:cNvPicPr>
                   </pic:nvPicPr>
                   <pic:blipFill>
-                    <a:blip r:embed="rId82" cstate="none"/>
+                    <a:blip r:embed="rId83" cstate="none"/>
                     <a:srcRect/>
                     <a:stretch>
                       <a:fillRect/>
@@ -8942,6 +9286,7 @@
     <w:p>
       <w:pPr>
         <w:pStyle w:val="ListParagraph"/>
+        <w:keepNext w:val="false"/>
         <w:keepLines/>
         <w:numPr>
           <w:ilvl w:val="0"/>
@@ -9096,7 +9441,7 @@
           <wp:inline distT="0" distB="0" distL="0" distR="0">
             <wp:extent cx="3781425" cy="876300"/>
             <wp:effectExtent t="19050" r="19050" b="19050" l="19050"/>
-            <wp:docPr id="37" name="theme-toggle" descr="The moon icon at the right of the top bar, Depot in its light look" title="The moon icon at the right of the top bar, Depot in its light look"/>
+            <wp:docPr id="38" name="theme-toggle" descr="The moon icon at the right of the top bar, Depot in its light look" title="The moon icon at the right of the top bar, Depot in its light look"/>
             <wp:cNvGraphicFramePr>
               <a:graphicFrameLocks xmlns:a="http://schemas.openxmlformats.org/drawingml/2006/main" noChangeAspect="1"/>
             </wp:cNvGraphicFramePr>
@@ -9110,7 +9455,7 @@
                     </pic:cNvPicPr>
                   </pic:nvPicPr>
                   <pic:blipFill>
-                    <a:blip r:embed="rId83" cstate="none"/>
+                    <a:blip r:embed="rId84" cstate="none"/>
                     <a:srcRect/>
                     <a:stretch>
                       <a:fillRect/>
@@ -9210,7 +9555,7 @@
           <wp:inline distT="0" distB="0" distL="0" distR="0">
             <wp:extent cx="4686300" cy="4210050"/>
             <wp:effectExtent t="19050" r="19050" b="19050" l="19050"/>
-            <wp:docPr id="38" name="appearance" descr="Settings, Profile &amp; appearance: Mode and Scheme, with a device scheme already picked" title="Settings, Profile &amp; appearance: Mode and Scheme, with a device scheme already picked"/>
+            <wp:docPr id="39" name="appearance" descr="Settings, Profile &amp; appearance: Mode and Scheme, with a device scheme already picked" title="Settings, Profile &amp; appearance: Mode and Scheme, with a device scheme already picked"/>
             <wp:cNvGraphicFramePr>
               <a:graphicFrameLocks xmlns:a="http://schemas.openxmlformats.org/drawingml/2006/main" noChangeAspect="1"/>
             </wp:cNvGraphicFramePr>
@@ -9224,7 +9569,7 @@
                     </pic:cNvPicPr>
                   </pic:nvPicPr>
                   <pic:blipFill>
-                    <a:blip r:embed="rId84" cstate="none"/>
+                    <a:blip r:embed="rId85" cstate="none"/>
                     <a:srcRect/>
                     <a:stretch>
                       <a:fillRect/>
@@ -9600,7 +9945,7 @@
           <wp:inline distT="0" distB="0" distL="0" distR="0">
             <wp:extent cx="5124450" cy="3686175"/>
             <wp:effectExtent t="19050" r="19050" b="19050" l="19050"/>
-            <wp:docPr id="39" name="file-page" descr="The page someone outside Acme sees when you share a file with them" title="The page someone outside Acme sees when you share a file with them"/>
+            <wp:docPr id="40" name="file-page" descr="The page someone outside Acme sees when you share a file with them" title="The page someone outside Acme sees when you share a file with them"/>
             <wp:cNvGraphicFramePr>
               <a:graphicFrameLocks xmlns:a="http://schemas.openxmlformats.org/drawingml/2006/main" noChangeAspect="1"/>
             </wp:cNvGraphicFramePr>
@@ -9614,7 +9959,7 @@
                     </pic:cNvPicPr>
                   </pic:nvPicPr>
                   <pic:blipFill>
-                    <a:blip r:embed="rId85" cstate="none"/>
+                    <a:blip r:embed="rId86" cstate="none"/>
                     <a:srcRect/>
                     <a:stretch>
                       <a:fillRect/>
@@ -9811,7 +10156,7 @@
           <wp:inline distT="0" distB="0" distL="0" distR="0">
             <wp:extent cx="4171950" cy="4210050"/>
             <wp:effectExtent t="19050" r="19050" b="19050" l="19050"/>
-            <wp:docPr id="40" name="folder-page" descr="The page someone outside Acme sees when you share a folder with them" title="The page someone outside Acme sees when you share a folder with them"/>
+            <wp:docPr id="41" name="folder-page" descr="The page someone outside Acme sees when you share a folder with them" title="The page someone outside Acme sees when you share a folder with them"/>
             <wp:cNvGraphicFramePr>
               <a:graphicFrameLocks xmlns:a="http://schemas.openxmlformats.org/drawingml/2006/main" noChangeAspect="1"/>
             </wp:cNvGraphicFramePr>
@@ -9825,7 +10170,7 @@
                     </pic:cNvPicPr>
                   </pic:nvPicPr>
                   <pic:blipFill>
-                    <a:blip r:embed="rId86" cstate="none"/>
+                    <a:blip r:embed="rId87" cstate="none"/>
                     <a:srcRect/>
                     <a:stretch>
                       <a:fillRect/>
@@ -10077,7 +10422,7 @@
           <wp:inline distT="0" distB="0" distL="0" distR="0">
             <wp:extent cx="5486400" cy="2333625"/>
             <wp:effectExtent t="19050" r="19050" b="19050" l="19050"/>
-            <wp:docPr id="41" name="link-gone" descr="The page someone sees when a link has expired" title="The page someone sees when a link has expired"/>
+            <wp:docPr id="42" name="link-gone" descr="The page someone sees when a link has expired" title="The page someone sees when a link has expired"/>
             <wp:cNvGraphicFramePr>
               <a:graphicFrameLocks xmlns:a="http://schemas.openxmlformats.org/drawingml/2006/main" noChangeAspect="1"/>
             </wp:cNvGraphicFramePr>
@@ -10091,7 +10436,7 @@
                     </pic:cNvPicPr>
                   </pic:nvPicPr>
                   <pic:blipFill>
-                    <a:blip r:embed="rId87" cstate="none"/>
+                    <a:blip r:embed="rId88" cstate="none"/>
                     <a:srcRect/>
                     <a:stretch>
                       <a:fillRect/>
@@ -10215,7 +10560,7 @@
             <wp:extent cx="7772400" cy="10058400"/>
             <wp:effectExtent t="0" r="0" b="0" l="0"/>
             <wp:wrapNone/>
-            <wp:docPr id="42" name="Dark page background" descr="" title=""/>
+            <wp:docPr id="43" name="Dark page background" descr="" title=""/>
             <wp:cNvGraphicFramePr>
               <a:graphicFrameLocks xmlns:a="http://schemas.openxmlformats.org/drawingml/2006/main" noChangeAspect="1"/>
             </wp:cNvGraphicFramePr>
@@ -10620,7 +10965,7 @@
           <wp:inline distT="0" distB="0" distL="0" distR="0">
             <wp:extent cx="2924175" cy="3200400"/>
             <wp:effectExtent t="19050" r="19050" b="19050" l="19050"/>
-            <wp:docPr id="43" name="meet-panel" descr="The Meetings panel: who is online, starting a call, and scheduling one" title="The Meetings panel: who is online, starting a call, and scheduling one"/>
+            <wp:docPr id="44" name="meet-panel" descr="The Meetings panel: who is online, starting a call, and scheduling one" title="The Meetings panel: who is online, starting a call, and scheduling one"/>
             <wp:cNvGraphicFramePr>
               <a:graphicFrameLocks xmlns:a="http://schemas.openxmlformats.org/drawingml/2006/main" noChangeAspect="1"/>
             </wp:cNvGraphicFramePr>
@@ -10634,7 +10979,7 @@
                     </pic:cNvPicPr>
                   </pic:nvPicPr>
                   <pic:blipFill>
-                    <a:blip r:embed="rId88" cstate="none"/>
+                    <a:blip r:embed="rId89" cstate="none"/>
                     <a:srcRect/>
                     <a:stretch>
                       <a:fillRect/>
@@ -11008,7 +11353,7 @@
           <wp:inline distT="0" distB="0" distL="0" distR="0">
             <wp:extent cx="4133850" cy="3790950"/>
             <wp:effectExtent t="19050" r="19050" b="19050" l="19050"/>
-            <wp:docPr id="44" name="in-call-controls" descr="The controls once you are in a call" title="The controls once you are in a call"/>
+            <wp:docPr id="45" name="in-call-controls" descr="The controls once you are in a call" title="The controls once you are in a call"/>
             <wp:cNvGraphicFramePr>
               <a:graphicFrameLocks xmlns:a="http://schemas.openxmlformats.org/drawingml/2006/main" noChangeAspect="1"/>
             </wp:cNvGraphicFramePr>
@@ -11022,7 +11367,7 @@
                     </pic:cNvPicPr>
                   </pic:nvPicPr>
                   <pic:blipFill>
-                    <a:blip r:embed="rId89" cstate="none"/>
+                    <a:blip r:embed="rId90" cstate="none"/>
                     <a:srcRect/>
                     <a:stretch>
                       <a:fillRect/>
@@ -11353,7 +11698,7 @@
                 <wp:inline distT="0" distB="0" distL="0" distR="0">
                   <wp:extent cx="2314575" cy="4752975"/>
                   <wp:effectExtent t="19050" r="19050" b="19050" l="19050"/>
-                  <wp:docPr id="45" name="switcher-open" descr="The library switcher, with the Share icon next to an owned library" title="The library switcher, with the Share icon next to an owned library"/>
+                  <wp:docPr id="46" name="switcher-open" descr="The library switcher, with the Share icon next to an owned library" title="The library switcher, with the Share icon next to an owned library"/>
                   <wp:cNvGraphicFramePr>
                     <a:graphicFrameLocks xmlns:a="http://schemas.openxmlformats.org/drawingml/2006/main" noChangeAspect="1"/>
                   </wp:cNvGraphicFramePr>
@@ -11367,7 +11712,7 @@
                           </pic:cNvPicPr>
                         </pic:nvPicPr>
                         <pic:blipFill>
-                          <a:blip r:embed="rId90" cstate="none"/>
+                          <a:blip r:embed="rId91" cstate="none"/>
                           <a:srcRect/>
                           <a:stretch>
                             <a:fillRect/>
@@ -11624,7 +11969,7 @@
           <wp:inline distT="0" distB="0" distL="0" distR="0">
             <wp:extent cx="5943600" cy="3171825"/>
             <wp:effectExtent t="19050" r="19050" b="19050" l="19050"/>
-            <wp:docPr id="46" name="share-add" descr="Adding someone to the Share tab, with Read-Write already chosen" title="Adding someone to the Share tab, with Read-Write already chosen"/>
+            <wp:docPr id="47" name="share-add" descr="Adding someone to the Share tab, with Read-Write already chosen" title="Adding someone to the Share tab, with Read-Write already chosen"/>
             <wp:cNvGraphicFramePr>
               <a:graphicFrameLocks xmlns:a="http://schemas.openxmlformats.org/drawingml/2006/main" noChangeAspect="1"/>
             </wp:cNvGraphicFramePr>
@@ -11638,7 +11983,7 @@
                     </pic:cNvPicPr>
                   </pic:nvPicPr>
                   <pic:blipFill>
-                    <a:blip r:embed="rId91" cstate="none"/>
+                    <a:blip r:embed="rId92" cstate="none"/>
                     <a:srcRect/>
                     <a:stretch>
                       <a:fillRect/>
@@ -11779,6 +12124,7 @@
     <w:p>
       <w:pPr>
         <w:pStyle w:val="ListParagraph"/>
+        <w:keepNext w:val="false"/>
         <w:keepLines/>
         <w:numPr>
           <w:ilvl w:val="0"/>
@@ -11800,6 +12146,7 @@
     <w:p>
       <w:pPr>
         <w:pStyle w:val="ListParagraph"/>
+        <w:keepNext w:val="false"/>
         <w:keepLines/>
         <w:numPr>
           <w:ilvl w:val="0"/>
@@ -11821,6 +12168,7 @@
     <w:p>
       <w:pPr>
         <w:pStyle w:val="ListParagraph"/>
+        <w:keepNext w:val="false"/>
         <w:keepLines/>
         <w:numPr>
           <w:ilvl w:val="0"/>
@@ -11951,7 +12299,7 @@
           <wp:inline distT="0" distB="0" distL="0" distR="0">
             <wp:extent cx="5562600" cy="2524125"/>
             <wp:effectExtent t="19050" r="19050" b="19050" l="19050"/>
-            <wp:docPr id="47" name="who-access" descr="Who has access: the Who has access tab, and one person’s row expanded to show the actions" title="Who has access: the Who has access tab, and one person’s row expanded to show the actions"/>
+            <wp:docPr id="48" name="who-access" descr="Who has access: the Who has access tab, and one person’s row expanded to show the actions" title="Who has access: the Who has access tab, and one person’s row expanded to show the actions"/>
             <wp:cNvGraphicFramePr>
               <a:graphicFrameLocks xmlns:a="http://schemas.openxmlformats.org/drawingml/2006/main" noChangeAspect="1"/>
             </wp:cNvGraphicFramePr>
@@ -11965,7 +12313,7 @@
                     </pic:cNvPicPr>
                   </pic:nvPicPr>
                   <pic:blipFill>
-                    <a:blip r:embed="rId92" cstate="none"/>
+                    <a:blip r:embed="rId93" cstate="none"/>
                     <a:srcRect/>
                     <a:stretch>
                       <a:fillRect/>
@@ -12056,6 +12404,7 @@
     <w:p>
       <w:pPr>
         <w:pStyle w:val="ListParagraph"/>
+        <w:keepNext w:val="false"/>
         <w:keepLines/>
         <w:numPr>
           <w:ilvl w:val="0"/>
@@ -12090,6 +12439,7 @@
     <w:p>
       <w:pPr>
         <w:pStyle w:val="ListParagraph"/>
+        <w:keepNext w:val="false"/>
         <w:keepLines/>
         <w:numPr>
           <w:ilvl w:val="0"/>
@@ -12406,7 +12756,7 @@
           <wp:inline distT="0" distB="0" distL="0" distR="0">
             <wp:extent cx="5943600" cy="3781425"/>
             <wp:effectExtent t="19050" r="19050" b="19050" l="19050"/>
-            <wp:docPr id="48" name="groups-list" descr="Settings, Groups: creating a group, with the groups you manage and belong to below" title="Settings, Groups: creating a group, with the groups you manage and belong to below"/>
+            <wp:docPr id="49" name="groups-list" descr="Settings, Groups: creating a group, with the groups you manage and belong to below" title="Settings, Groups: creating a group, with the groups you manage and belong to below"/>
             <wp:cNvGraphicFramePr>
               <a:graphicFrameLocks xmlns:a="http://schemas.openxmlformats.org/drawingml/2006/main" noChangeAspect="1"/>
             </wp:cNvGraphicFramePr>
@@ -12420,7 +12770,7 @@
                     </pic:cNvPicPr>
                   </pic:nvPicPr>
                   <pic:blipFill>
-                    <a:blip r:embed="rId93" cstate="none"/>
+                    <a:blip r:embed="rId94" cstate="none"/>
                     <a:srcRect/>
                     <a:stretch>
                       <a:fillRect/>
@@ -12545,7 +12895,7 @@
           <wp:inline distT="0" distB="0" distL="0" distR="0">
             <wp:extent cx="5553075" cy="4210050"/>
             <wp:effectExtent t="19050" r="19050" b="19050" l="19050"/>
-            <wp:docPr id="49" name="group-open" descr="A group you manage: its members, and the field for adding another by email" title="A group you manage: its members, and the field for adding another by email"/>
+            <wp:docPr id="50" name="group-open" descr="A group you manage: its members, and the field for adding another by email" title="A group you manage: its members, and the field for adding another by email"/>
             <wp:cNvGraphicFramePr>
               <a:graphicFrameLocks xmlns:a="http://schemas.openxmlformats.org/drawingml/2006/main" noChangeAspect="1"/>
             </wp:cNvGraphicFramePr>
@@ -12559,7 +12909,7 @@
                     </pic:cNvPicPr>
                   </pic:nvPicPr>
                   <pic:blipFill>
-                    <a:blip r:embed="rId94" cstate="none"/>
+                    <a:blip r:embed="rId95" cstate="none"/>
                     <a:srcRect/>
                     <a:stretch>
                       <a:fillRect/>
@@ -12640,6 +12990,7 @@
     <w:p>
       <w:pPr>
         <w:pStyle w:val="ListParagraph"/>
+        <w:keepNext w:val="false"/>
         <w:keepLines/>
         <w:numPr>
           <w:ilvl w:val="0"/>
@@ -12794,7 +13145,7 @@
           <wp:inline distT="0" distB="0" distL="0" distR="0">
             <wp:extent cx="5943600" cy="3714750"/>
             <wp:effectExtent t="19050" r="19050" b="19050" l="19050"/>
-            <wp:docPr id="50" name="browse" descr="A connected SharePoint library, with its toolbar and one file’s actions" title="A connected SharePoint library, with its toolbar and one file’s actions"/>
+            <wp:docPr id="51" name="browse" descr="A connected SharePoint library, with its toolbar and one file’s actions" title="A connected SharePoint library, with its toolbar and one file’s actions"/>
             <wp:cNvGraphicFramePr>
               <a:graphicFrameLocks xmlns:a="http://schemas.openxmlformats.org/drawingml/2006/main" noChangeAspect="1"/>
             </wp:cNvGraphicFramePr>
@@ -12808,7 +13159,7 @@
                     </pic:cNvPicPr>
                   </pic:nvPicPr>
                   <pic:blipFill>
-                    <a:blip r:embed="rId95" cstate="none"/>
+                    <a:blip r:embed="rId96" cstate="none"/>
                     <a:srcRect/>
                     <a:stretch>
                       <a:fillRect/>
@@ -12964,6 +13315,7 @@
     <w:p>
       <w:pPr>
         <w:pStyle w:val="ListParagraph"/>
+        <w:keepNext w:val="false"/>
         <w:keepLines/>
         <w:numPr>
           <w:ilvl w:val="0"/>
@@ -12998,6 +13350,7 @@
     <w:p>
       <w:pPr>
         <w:pStyle w:val="ListParagraph"/>
+        <w:keepNext w:val="false"/>
         <w:keepLines/>
         <w:numPr>
           <w:ilvl w:val="0"/>
@@ -13012,6 +13365,7 @@
     <w:p>
       <w:pPr>
         <w:pStyle w:val="ListParagraph"/>
+        <w:keepNext w:val="false"/>
         <w:keepLines/>
         <w:numPr>
           <w:ilvl w:val="0"/>
@@ -13062,7 +13416,7 @@
           <wp:inline distT="0" distB="0" distL="0" distR="0">
             <wp:extent cx="2009775" cy="2295525"/>
             <wp:effectExtent t="19050" r="19050" b="19050" l="19050"/>
-            <wp:docPr id="51" name="share-menu" descr="The Share menu on a SharePoint file" title="The Share menu on a SharePoint file"/>
+            <wp:docPr id="52" name="share-menu" descr="The Share menu on a SharePoint file" title="The Share menu on a SharePoint file"/>
             <wp:cNvGraphicFramePr>
               <a:graphicFrameLocks xmlns:a="http://schemas.openxmlformats.org/drawingml/2006/main" noChangeAspect="1"/>
             </wp:cNvGraphicFramePr>
@@ -13076,7 +13430,7 @@
                     </pic:cNvPicPr>
                   </pic:nvPicPr>
                   <pic:blipFill>
-                    <a:blip r:embed="rId96" cstate="none"/>
+                    <a:blip r:embed="rId97" cstate="none"/>
                     <a:srcRect/>
                     <a:stretch>
                       <a:fillRect/>
@@ -13216,7 +13570,7 @@
           <wp:inline distT="0" distB="0" distL="0" distR="0">
             <wp:extent cx="4619625" cy="4210050"/>
             <wp:effectExtent t="19050" r="19050" b="19050" l="19050"/>
-            <wp:docPr id="52" name="unlock" descr="The Unlock dialog for a personal Windows share" title="The Unlock dialog for a personal Windows share"/>
+            <wp:docPr id="53" name="unlock" descr="The Unlock dialog for a personal Windows share" title="The Unlock dialog for a personal Windows share"/>
             <wp:cNvGraphicFramePr>
               <a:graphicFrameLocks xmlns:a="http://schemas.openxmlformats.org/drawingml/2006/main" noChangeAspect="1"/>
             </wp:cNvGraphicFramePr>
@@ -13230,7 +13584,7 @@
                     </pic:cNvPicPr>
                   </pic:nvPicPr>
                   <pic:blipFill>
-                    <a:blip r:embed="rId97" cstate="none"/>
+                    <a:blip r:embed="rId98" cstate="none"/>
                     <a:srcRect/>
                     <a:stretch>
                       <a:fillRect/>
@@ -13571,7 +13925,7 @@
           <wp:inline distT="0" distB="0" distL="0" distR="0">
             <wp:extent cx="3562350" cy="2609850"/>
             <wp:effectExtent t="19050" r="19050" b="19050" l="19050"/>
-            <wp:docPr id="53" name="home" descr="Home on a phone, with the account menu open" title="Home on a phone, with the account menu open"/>
+            <wp:docPr id="54" name="home" descr="Home on a phone, with the account menu open" title="Home on a phone, with the account menu open"/>
             <wp:cNvGraphicFramePr>
               <a:graphicFrameLocks xmlns:a="http://schemas.openxmlformats.org/drawingml/2006/main" noChangeAspect="1"/>
             </wp:cNvGraphicFramePr>
@@ -13585,7 +13939,7 @@
                     </pic:cNvPicPr>
                   </pic:nvPicPr>
                   <pic:blipFill>
-                    <a:blip r:embed="rId98" cstate="none"/>
+                    <a:blip r:embed="rId99" cstate="none"/>
                     <a:srcRect/>
                     <a:stretch>
                       <a:fillRect/>
@@ -13737,7 +14091,7 @@
                 <wp:inline distT="0" distB="0" distL="0" distR="0">
                   <wp:extent cx="2533650" cy="5486400"/>
                   <wp:effectExtent t="19050" r="19050" b="19050" l="19050"/>
-                  <wp:docPr id="54" name="files" descr="The Files page on a phone, with the Upload menu open" title="The Files page on a phone, with the Upload menu open"/>
+                  <wp:docPr id="55" name="files" descr="The Files page on a phone, with the Upload menu open" title="The Files page on a phone, with the Upload menu open"/>
                   <wp:cNvGraphicFramePr>
                     <a:graphicFrameLocks xmlns:a="http://schemas.openxmlformats.org/drawingml/2006/main" noChangeAspect="1"/>
                   </wp:cNvGraphicFramePr>
@@ -13751,7 +14105,7 @@
                           </pic:cNvPicPr>
                         </pic:nvPicPr>
                         <pic:blipFill>
-                          <a:blip r:embed="rId99" cstate="none"/>
+                          <a:blip r:embed="rId100" cstate="none"/>
                           <a:srcRect/>
                           <a:stretch>
                             <a:fillRect/>
@@ -13926,7 +14280,7 @@
         <w:sz w:val="22"/>
         <w:szCs w:val="22"/>
       </w:rPr>
-      <w:t xml:space="preserve">Edition 2026.09</w:t>
+      <w:t xml:space="preserve">Edition 2026.10</w:t>
     </w:r>
   </w:p>
 </w:ftr>

</xml_diff>